<commit_message>
ALM report: header on pages 1-2 only, plain page numbers, contents-only page 3
Co-Authored-By: Claude Sonnet 5.5 <noreply@anthropic.com>
Claude-Session: https://claude.ai/code/session_0119xxGj3NY185HcqPsLitZ4
</commit_message>
<xml_diff>
--- a/alm/ALM_Student_Registration_Form.docx
+++ b/alm/ALM_Student_Registration_Form.docx
@@ -1591,6 +1591,20 @@
           <w:sz w:val="28"/>
           <w:szCs w:val="28"/>
         </w:rPr>
+        <w:sectPr>
+          <w:headerReference w:type="default" r:id="rId8"/>
+          <w:footerReference w:type="default" r:id="rId17"/>
+          <w:pgSz w:w="11907" w:h="16840" w:code="9"/>
+          <w:pgMar w:top="1020" w:right="1134" w:bottom="864" w:left="1440" w:header="709" w:footer="360" w:gutter="0"/>
+          <w:pgBorders w:offsetFrom="page">
+            <w:top w:val="single" w:sz="12" w:space="20" w:color="000000"/>
+            <w:left w:val="single" w:sz="12" w:space="20" w:color="000000"/>
+            <w:bottom w:val="single" w:sz="12" w:space="20" w:color="000000"/>
+            <w:right w:val="single" w:sz="12" w:space="20" w:color="000000"/>
+          </w:pgBorders>
+          <w:cols w:space="708"/>
+          <w:docGrid w:linePitch="360"/>
+        </w:sectPr>
       </w:pPr>
       <w:r>
         <w:rPr>
@@ -1643,7 +1657,6 @@
     </w:p>
     <w:p>
       <w:pPr>
-        <w:pageBreakBefore/>
         <w:contextualSpacing/>
         <w:jc w:val="center"/>
         <w:rPr>
@@ -1910,7 +1923,7 @@
                 <w:rFonts w:ascii="Times New Roman" w:hAnsi="Times New Roman"/>
                 <w:sz w:val="24"/>
               </w:rPr>
-              <w:t>3</w:t>
+              <w:t>4</w:t>
             </w:r>
           </w:p>
         </w:tc>
@@ -2066,7 +2079,7 @@
                 <w:rFonts w:ascii="Times New Roman" w:hAnsi="Times New Roman"/>
                 <w:sz w:val="24"/>
               </w:rPr>
-              <w:t>4</w:t>
+              <w:t>5</w:t>
             </w:r>
           </w:p>
         </w:tc>
@@ -2249,6 +2262,7 @@
     <w:p>
       <w:pPr>
         <w:keepNext/>
+        <w:pageBreakBefore/>
         <w:pBdr>
           <w:bottom w:val="single" w:sz="8" w:space="1" w:color="000000"/>
         </w:pBdr>
@@ -8899,6 +8913,610 @@
           <w:i w:val="0"/>
           <w:sz w:val="24"/>
         </w:rPr>
+        <w:t>HTML5 validation attributes used in the form</w:t>
+      </w:r>
+    </w:p>
+    <w:tbl>
+      <w:tblPr>
+        <w:tblW w:type="auto" w:w="0"/>
+        <w:tblBorders>
+          <w:top w:val="single" w:sz="6" w:space="0" w:color="000000"/>
+          <w:left w:val="single" w:sz="6" w:space="0" w:color="000000"/>
+          <w:bottom w:val="single" w:sz="6" w:space="0" w:color="000000"/>
+          <w:right w:val="single" w:sz="6" w:space="0" w:color="000000"/>
+          <w:insideH w:val="single" w:sz="6" w:space="0" w:color="000000"/>
+          <w:insideV w:val="single" w:sz="6" w:space="0" w:color="000000"/>
+        </w:tblBorders>
+        <w:tblLayout w:type="fixed"/>
+        <w:tblLook w:firstColumn="1" w:firstRow="1" w:lastColumn="0" w:lastRow="0" w:noHBand="0" w:noVBand="1" w:val="04A0"/>
+      </w:tblPr>
+      <w:tblGrid>
+        <w:gridCol w:w="2448"/>
+        <w:gridCol w:w="3312"/>
+        <w:gridCol w:w="3456"/>
+      </w:tblGrid>
+      <w:tr>
+        <w:trPr>
+          <w:tblHeader/>
+          <w:cantSplit/>
+        </w:trPr>
+        <w:tc>
+          <w:tcPr>
+            <w:tcW w:type="dxa" w:w="2448"/>
+            <w:shd w:val="clear" w:color="auto" w:fill="D9E2D5"/>
+          </w:tcPr>
+          <w:p>
+            <w:pPr>
+              <w:spacing w:after="40" w:before="40"/>
+              <w:jc w:val="center"/>
+            </w:pPr>
+            <w:r>
+              <w:rPr>
+                <w:rFonts w:ascii="Times New Roman" w:hAnsi="Times New Roman"/>
+                <w:b/>
+                <w:sz w:val="21"/>
+              </w:rPr>
+              <w:t>Attribute</w:t>
+            </w:r>
+          </w:p>
+        </w:tc>
+        <w:tc>
+          <w:tcPr>
+            <w:tcW w:type="dxa" w:w="3312"/>
+            <w:shd w:val="clear" w:color="auto" w:fill="D9E2D5"/>
+          </w:tcPr>
+          <w:p>
+            <w:pPr>
+              <w:spacing w:after="40" w:before="40"/>
+              <w:jc w:val="center"/>
+            </w:pPr>
+            <w:r>
+              <w:rPr>
+                <w:rFonts w:ascii="Times New Roman" w:hAnsi="Times New Roman"/>
+                <w:b/>
+                <w:sz w:val="21"/>
+              </w:rPr>
+              <w:t>Purpose</w:t>
+            </w:r>
+          </w:p>
+        </w:tc>
+        <w:tc>
+          <w:tcPr>
+            <w:tcW w:type="dxa" w:w="3456"/>
+            <w:shd w:val="clear" w:color="auto" w:fill="D9E2D5"/>
+          </w:tcPr>
+          <w:p>
+            <w:pPr>
+              <w:spacing w:after="40" w:before="40"/>
+              <w:jc w:val="center"/>
+            </w:pPr>
+            <w:r>
+              <w:rPr>
+                <w:rFonts w:ascii="Times New Roman" w:hAnsi="Times New Roman"/>
+                <w:b/>
+                <w:sz w:val="21"/>
+              </w:rPr>
+              <w:t>Used on</w:t>
+            </w:r>
+          </w:p>
+        </w:tc>
+      </w:tr>
+      <w:tr>
+        <w:trPr>
+          <w:cantSplit/>
+        </w:trPr>
+        <w:tc>
+          <w:tcPr>
+            <w:tcW w:type="dxa" w:w="2448"/>
+          </w:tcPr>
+          <w:p>
+            <w:pPr>
+              <w:spacing w:after="40" w:before="40"/>
+              <w:jc w:val="left"/>
+            </w:pPr>
+            <w:r>
+              <w:rPr>
+                <w:rFonts w:ascii="Times New Roman" w:hAnsi="Times New Roman"/>
+                <w:b/>
+                <w:sz w:val="21"/>
+              </w:rPr>
+              <w:t>required</w:t>
+            </w:r>
+          </w:p>
+        </w:tc>
+        <w:tc>
+          <w:tcPr>
+            <w:tcW w:type="dxa" w:w="3312"/>
+          </w:tcPr>
+          <w:p>
+            <w:pPr>
+              <w:spacing w:after="40" w:before="40"/>
+              <w:jc w:val="left"/>
+            </w:pPr>
+            <w:r>
+              <w:rPr>
+                <w:rFonts w:ascii="Times New Roman" w:hAnsi="Times New Roman"/>
+                <w:b w:val="0"/>
+                <w:sz w:val="21"/>
+              </w:rPr>
+              <w:t>Field cannot be left empty</w:t>
+            </w:r>
+          </w:p>
+        </w:tc>
+        <w:tc>
+          <w:tcPr>
+            <w:tcW w:type="dxa" w:w="3456"/>
+          </w:tcPr>
+          <w:p>
+            <w:pPr>
+              <w:spacing w:after="40" w:before="40"/>
+              <w:jc w:val="left"/>
+            </w:pPr>
+            <w:r>
+              <w:rPr>
+                <w:rFonts w:ascii="Times New Roman" w:hAnsi="Times New Roman"/>
+                <w:b w:val="0"/>
+                <w:sz w:val="21"/>
+              </w:rPr>
+              <w:t>Name, date of birth, email, phone, password, course, terms</w:t>
+            </w:r>
+          </w:p>
+        </w:tc>
+      </w:tr>
+      <w:tr>
+        <w:trPr>
+          <w:cantSplit/>
+        </w:trPr>
+        <w:tc>
+          <w:tcPr>
+            <w:tcW w:type="dxa" w:w="2448"/>
+          </w:tcPr>
+          <w:p>
+            <w:pPr>
+              <w:spacing w:after="40" w:before="40"/>
+              <w:jc w:val="left"/>
+            </w:pPr>
+            <w:r>
+              <w:rPr>
+                <w:rFonts w:ascii="Times New Roman" w:hAnsi="Times New Roman"/>
+                <w:b/>
+                <w:sz w:val="21"/>
+              </w:rPr>
+              <w:t>minlength / maxlength</w:t>
+            </w:r>
+          </w:p>
+        </w:tc>
+        <w:tc>
+          <w:tcPr>
+            <w:tcW w:type="dxa" w:w="3312"/>
+          </w:tcPr>
+          <w:p>
+            <w:pPr>
+              <w:spacing w:after="40" w:before="40"/>
+              <w:jc w:val="left"/>
+            </w:pPr>
+            <w:r>
+              <w:rPr>
+                <w:rFonts w:ascii="Times New Roman" w:hAnsi="Times New Roman"/>
+                <w:b w:val="0"/>
+                <w:sz w:val="21"/>
+              </w:rPr>
+              <w:t>Limits the number of characters</w:t>
+            </w:r>
+          </w:p>
+        </w:tc>
+        <w:tc>
+          <w:tcPr>
+            <w:tcW w:type="dxa" w:w="3456"/>
+          </w:tcPr>
+          <w:p>
+            <w:pPr>
+              <w:spacing w:after="40" w:before="40"/>
+              <w:jc w:val="left"/>
+            </w:pPr>
+            <w:r>
+              <w:rPr>
+                <w:rFonts w:ascii="Times New Roman" w:hAnsi="Times New Roman"/>
+                <w:b w:val="0"/>
+                <w:sz w:val="21"/>
+              </w:rPr>
+              <w:t>Name, password, phone, address</w:t>
+            </w:r>
+          </w:p>
+        </w:tc>
+      </w:tr>
+      <w:tr>
+        <w:trPr>
+          <w:cantSplit/>
+        </w:trPr>
+        <w:tc>
+          <w:tcPr>
+            <w:tcW w:type="dxa" w:w="2448"/>
+          </w:tcPr>
+          <w:p>
+            <w:pPr>
+              <w:spacing w:after="40" w:before="40"/>
+              <w:jc w:val="left"/>
+            </w:pPr>
+            <w:r>
+              <w:rPr>
+                <w:rFonts w:ascii="Times New Roman" w:hAnsi="Times New Roman"/>
+                <w:b/>
+                <w:sz w:val="21"/>
+              </w:rPr>
+              <w:t>pattern</w:t>
+            </w:r>
+          </w:p>
+        </w:tc>
+        <w:tc>
+          <w:tcPr>
+            <w:tcW w:type="dxa" w:w="3312"/>
+          </w:tcPr>
+          <w:p>
+            <w:pPr>
+              <w:spacing w:after="40" w:before="40"/>
+              <w:jc w:val="left"/>
+            </w:pPr>
+            <w:r>
+              <w:rPr>
+                <w:rFonts w:ascii="Times New Roman" w:hAnsi="Times New Roman"/>
+                <w:b w:val="0"/>
+                <w:sz w:val="21"/>
+              </w:rPr>
+              <w:t>Regular expression the value must match</w:t>
+            </w:r>
+          </w:p>
+        </w:tc>
+        <w:tc>
+          <w:tcPr>
+            <w:tcW w:type="dxa" w:w="3456"/>
+          </w:tcPr>
+          <w:p>
+            <w:pPr>
+              <w:spacing w:after="40" w:before="40"/>
+              <w:jc w:val="left"/>
+            </w:pPr>
+            <w:r>
+              <w:rPr>
+                <w:rFonts w:ascii="Times New Roman" w:hAnsi="Times New Roman"/>
+                <w:b w:val="0"/>
+                <w:sz w:val="21"/>
+              </w:rPr>
+              <w:t>Name, phone, password</w:t>
+            </w:r>
+          </w:p>
+        </w:tc>
+      </w:tr>
+      <w:tr>
+        <w:trPr>
+          <w:cantSplit/>
+        </w:trPr>
+        <w:tc>
+          <w:tcPr>
+            <w:tcW w:type="dxa" w:w="2448"/>
+          </w:tcPr>
+          <w:p>
+            <w:pPr>
+              <w:spacing w:after="40" w:before="40"/>
+              <w:jc w:val="left"/>
+            </w:pPr>
+            <w:r>
+              <w:rPr>
+                <w:rFonts w:ascii="Times New Roman" w:hAnsi="Times New Roman"/>
+                <w:b/>
+                <w:sz w:val="21"/>
+              </w:rPr>
+              <w:t>min / max</w:t>
+            </w:r>
+          </w:p>
+        </w:tc>
+        <w:tc>
+          <w:tcPr>
+            <w:tcW w:type="dxa" w:w="3312"/>
+          </w:tcPr>
+          <w:p>
+            <w:pPr>
+              <w:spacing w:after="40" w:before="40"/>
+              <w:jc w:val="left"/>
+            </w:pPr>
+            <w:r>
+              <w:rPr>
+                <w:rFonts w:ascii="Times New Roman" w:hAnsi="Times New Roman"/>
+                <w:b w:val="0"/>
+                <w:sz w:val="21"/>
+              </w:rPr>
+              <w:t>Lowest and highest allowed value or date</w:t>
+            </w:r>
+          </w:p>
+        </w:tc>
+        <w:tc>
+          <w:tcPr>
+            <w:tcW w:type="dxa" w:w="3456"/>
+          </w:tcPr>
+          <w:p>
+            <w:pPr>
+              <w:spacing w:after="40" w:before="40"/>
+              <w:jc w:val="left"/>
+            </w:pPr>
+            <w:r>
+              <w:rPr>
+                <w:rFonts w:ascii="Times New Roman" w:hAnsi="Times New Roman"/>
+                <w:b w:val="0"/>
+                <w:sz w:val="21"/>
+              </w:rPr>
+              <w:t>Date of birth, experience, study hours</w:t>
+            </w:r>
+          </w:p>
+        </w:tc>
+      </w:tr>
+      <w:tr>
+        <w:trPr>
+          <w:cantSplit/>
+        </w:trPr>
+        <w:tc>
+          <w:tcPr>
+            <w:tcW w:type="dxa" w:w="2448"/>
+          </w:tcPr>
+          <w:p>
+            <w:pPr>
+              <w:spacing w:after="40" w:before="40"/>
+              <w:jc w:val="left"/>
+            </w:pPr>
+            <w:r>
+              <w:rPr>
+                <w:rFonts w:ascii="Times New Roman" w:hAnsi="Times New Roman"/>
+                <w:b/>
+                <w:sz w:val="21"/>
+              </w:rPr>
+              <w:t>step</w:t>
+            </w:r>
+          </w:p>
+        </w:tc>
+        <w:tc>
+          <w:tcPr>
+            <w:tcW w:type="dxa" w:w="3312"/>
+          </w:tcPr>
+          <w:p>
+            <w:pPr>
+              <w:spacing w:after="40" w:before="40"/>
+              <w:jc w:val="left"/>
+            </w:pPr>
+            <w:r>
+              <w:rPr>
+                <w:rFonts w:ascii="Times New Roman" w:hAnsi="Times New Roman"/>
+                <w:b w:val="0"/>
+                <w:sz w:val="21"/>
+              </w:rPr>
+              <w:t>Step size of a number input</w:t>
+            </w:r>
+          </w:p>
+        </w:tc>
+        <w:tc>
+          <w:tcPr>
+            <w:tcW w:type="dxa" w:w="3456"/>
+          </w:tcPr>
+          <w:p>
+            <w:pPr>
+              <w:spacing w:after="40" w:before="40"/>
+              <w:jc w:val="left"/>
+            </w:pPr>
+            <w:r>
+              <w:rPr>
+                <w:rFonts w:ascii="Times New Roman" w:hAnsi="Times New Roman"/>
+                <w:b w:val="0"/>
+                <w:sz w:val="21"/>
+              </w:rPr>
+              <w:t>Years of experience</w:t>
+            </w:r>
+          </w:p>
+        </w:tc>
+      </w:tr>
+      <w:tr>
+        <w:trPr>
+          <w:cantSplit/>
+        </w:trPr>
+        <w:tc>
+          <w:tcPr>
+            <w:tcW w:type="dxa" w:w="2448"/>
+          </w:tcPr>
+          <w:p>
+            <w:pPr>
+              <w:spacing w:after="40" w:before="40"/>
+              <w:jc w:val="left"/>
+            </w:pPr>
+            <w:r>
+              <w:rPr>
+                <w:rFonts w:ascii="Times New Roman" w:hAnsi="Times New Roman"/>
+                <w:b/>
+                <w:sz w:val="21"/>
+              </w:rPr>
+              <w:t>accept</w:t>
+            </w:r>
+          </w:p>
+        </w:tc>
+        <w:tc>
+          <w:tcPr>
+            <w:tcW w:type="dxa" w:w="3312"/>
+          </w:tcPr>
+          <w:p>
+            <w:pPr>
+              <w:spacing w:after="40" w:before="40"/>
+              <w:jc w:val="left"/>
+            </w:pPr>
+            <w:r>
+              <w:rPr>
+                <w:rFonts w:ascii="Times New Roman" w:hAnsi="Times New Roman"/>
+                <w:b w:val="0"/>
+                <w:sz w:val="21"/>
+              </w:rPr>
+              <w:t>Allowed file types</w:t>
+            </w:r>
+          </w:p>
+        </w:tc>
+        <w:tc>
+          <w:tcPr>
+            <w:tcW w:type="dxa" w:w="3456"/>
+          </w:tcPr>
+          <w:p>
+            <w:pPr>
+              <w:spacing w:after="40" w:before="40"/>
+              <w:jc w:val="left"/>
+            </w:pPr>
+            <w:r>
+              <w:rPr>
+                <w:rFonts w:ascii="Times New Roman" w:hAnsi="Times New Roman"/>
+                <w:b w:val="0"/>
+                <w:sz w:val="21"/>
+              </w:rPr>
+              <w:t>Profile photo (PNG, JPEG)</w:t>
+            </w:r>
+          </w:p>
+        </w:tc>
+      </w:tr>
+      <w:tr>
+        <w:trPr>
+          <w:cantSplit/>
+        </w:trPr>
+        <w:tc>
+          <w:tcPr>
+            <w:tcW w:type="dxa" w:w="2448"/>
+          </w:tcPr>
+          <w:p>
+            <w:pPr>
+              <w:spacing w:after="40" w:before="40"/>
+              <w:jc w:val="left"/>
+            </w:pPr>
+            <w:r>
+              <w:rPr>
+                <w:rFonts w:ascii="Times New Roman" w:hAnsi="Times New Roman"/>
+                <w:b/>
+                <w:sz w:val="21"/>
+              </w:rPr>
+              <w:t>list (datalist)</w:t>
+            </w:r>
+          </w:p>
+        </w:tc>
+        <w:tc>
+          <w:tcPr>
+            <w:tcW w:type="dxa" w:w="3312"/>
+          </w:tcPr>
+          <w:p>
+            <w:pPr>
+              <w:spacing w:after="40" w:before="40"/>
+              <w:jc w:val="left"/>
+            </w:pPr>
+            <w:r>
+              <w:rPr>
+                <w:rFonts w:ascii="Times New Roman" w:hAnsi="Times New Roman"/>
+                <w:b w:val="0"/>
+                <w:sz w:val="21"/>
+              </w:rPr>
+              <w:t>Type-ahead suggestions</w:t>
+            </w:r>
+          </w:p>
+        </w:tc>
+        <w:tc>
+          <w:tcPr>
+            <w:tcW w:type="dxa" w:w="3456"/>
+          </w:tcPr>
+          <w:p>
+            <w:pPr>
+              <w:spacing w:after="40" w:before="40"/>
+              <w:jc w:val="left"/>
+            </w:pPr>
+            <w:r>
+              <w:rPr>
+                <w:rFonts w:ascii="Times New Roman" w:hAnsi="Times New Roman"/>
+                <w:b w:val="0"/>
+                <w:sz w:val="21"/>
+              </w:rPr>
+              <w:t>Course</w:t>
+            </w:r>
+          </w:p>
+        </w:tc>
+      </w:tr>
+      <w:tr>
+        <w:trPr>
+          <w:cantSplit/>
+        </w:trPr>
+        <w:tc>
+          <w:tcPr>
+            <w:tcW w:type="dxa" w:w="2448"/>
+          </w:tcPr>
+          <w:p>
+            <w:pPr>
+              <w:spacing w:after="40" w:before="40"/>
+              <w:jc w:val="left"/>
+            </w:pPr>
+            <w:r>
+              <w:rPr>
+                <w:rFonts w:ascii="Times New Roman" w:hAnsi="Times New Roman"/>
+                <w:b/>
+                <w:sz w:val="21"/>
+              </w:rPr>
+              <w:t>placeholder / autocomplete</w:t>
+            </w:r>
+          </w:p>
+        </w:tc>
+        <w:tc>
+          <w:tcPr>
+            <w:tcW w:type="dxa" w:w="3312"/>
+          </w:tcPr>
+          <w:p>
+            <w:pPr>
+              <w:spacing w:after="40" w:before="40"/>
+              <w:jc w:val="left"/>
+            </w:pPr>
+            <w:r>
+              <w:rPr>
+                <w:rFonts w:ascii="Times New Roman" w:hAnsi="Times New Roman"/>
+                <w:b w:val="0"/>
+                <w:sz w:val="21"/>
+              </w:rPr>
+              <w:t>Sample text and browser auto-fill hints</w:t>
+            </w:r>
+          </w:p>
+        </w:tc>
+        <w:tc>
+          <w:tcPr>
+            <w:tcW w:type="dxa" w:w="3456"/>
+          </w:tcPr>
+          <w:p>
+            <w:pPr>
+              <w:spacing w:after="40" w:before="40"/>
+              <w:jc w:val="left"/>
+            </w:pPr>
+            <w:r>
+              <w:rPr>
+                <w:rFonts w:ascii="Times New Roman" w:hAnsi="Times New Roman"/>
+                <w:b w:val="0"/>
+                <w:sz w:val="21"/>
+              </w:rPr>
+              <w:t>Name, email, phone, passwords</w:t>
+            </w:r>
+          </w:p>
+        </w:tc>
+      </w:tr>
+    </w:tbl>
+    <w:p>
+      <w:pPr>
+        <w:spacing w:after="80" w:before="0" w:line="276" w:lineRule="auto"/>
+        <w:jc w:val="both"/>
+      </w:pPr>
+    </w:p>
+    <w:p>
+      <w:pPr>
+        <w:keepNext/>
+        <w:spacing w:after="80" w:before="120" w:line="276" w:lineRule="auto"/>
+        <w:jc w:val="left"/>
+      </w:pPr>
+      <w:r>
+        <w:rPr>
+          <w:rFonts w:ascii="Times New Roman" w:hAnsi="Times New Roman" w:eastAsia="Times New Roman"/>
+          <w:b/>
+          <w:i w:val="0"/>
+          <w:sz w:val="24"/>
+        </w:rPr>
         <w:t>Sample test data used for the outputs</w:t>
       </w:r>
     </w:p>
@@ -9627,6 +10245,548 @@
           <w:i w:val="0"/>
           <w:sz w:val="24"/>
         </w:rPr>
+        <w:t>Behaviour of the main input types in the browser</w:t>
+      </w:r>
+    </w:p>
+    <w:tbl>
+      <w:tblPr>
+        <w:tblW w:type="auto" w:w="0"/>
+        <w:tblBorders>
+          <w:top w:val="single" w:sz="6" w:space="0" w:color="000000"/>
+          <w:left w:val="single" w:sz="6" w:space="0" w:color="000000"/>
+          <w:bottom w:val="single" w:sz="6" w:space="0" w:color="000000"/>
+          <w:right w:val="single" w:sz="6" w:space="0" w:color="000000"/>
+          <w:insideH w:val="single" w:sz="6" w:space="0" w:color="000000"/>
+          <w:insideV w:val="single" w:sz="6" w:space="0" w:color="000000"/>
+        </w:tblBorders>
+        <w:tblLayout w:type="fixed"/>
+        <w:tblLook w:firstColumn="1" w:firstRow="1" w:lastColumn="0" w:lastRow="0" w:noHBand="0" w:noVBand="1" w:val="04A0"/>
+      </w:tblPr>
+      <w:tblGrid>
+        <w:gridCol w:w="2160"/>
+        <w:gridCol w:w="3600"/>
+        <w:gridCol w:w="3456"/>
+      </w:tblGrid>
+      <w:tr>
+        <w:trPr>
+          <w:tblHeader/>
+          <w:cantSplit/>
+        </w:trPr>
+        <w:tc>
+          <w:tcPr>
+            <w:tcW w:type="dxa" w:w="2160"/>
+            <w:shd w:val="clear" w:color="auto" w:fill="D9E2D5"/>
+          </w:tcPr>
+          <w:p>
+            <w:pPr>
+              <w:spacing w:after="40" w:before="40"/>
+              <w:jc w:val="center"/>
+            </w:pPr>
+            <w:r>
+              <w:rPr>
+                <w:rFonts w:ascii="Times New Roman" w:hAnsi="Times New Roman"/>
+                <w:b/>
+                <w:sz w:val="21"/>
+              </w:rPr>
+              <w:t>Input type</w:t>
+            </w:r>
+          </w:p>
+        </w:tc>
+        <w:tc>
+          <w:tcPr>
+            <w:tcW w:type="dxa" w:w="3600"/>
+            <w:shd w:val="clear" w:color="auto" w:fill="D9E2D5"/>
+          </w:tcPr>
+          <w:p>
+            <w:pPr>
+              <w:spacing w:after="40" w:before="40"/>
+              <w:jc w:val="center"/>
+            </w:pPr>
+            <w:r>
+              <w:rPr>
+                <w:rFonts w:ascii="Times New Roman" w:hAnsi="Times New Roman"/>
+                <w:b/>
+                <w:sz w:val="21"/>
+              </w:rPr>
+              <w:t>On a desktop browser</w:t>
+            </w:r>
+          </w:p>
+        </w:tc>
+        <w:tc>
+          <w:tcPr>
+            <w:tcW w:type="dxa" w:w="3456"/>
+            <w:shd w:val="clear" w:color="auto" w:fill="D9E2D5"/>
+          </w:tcPr>
+          <w:p>
+            <w:pPr>
+              <w:spacing w:after="40" w:before="40"/>
+              <w:jc w:val="center"/>
+            </w:pPr>
+            <w:r>
+              <w:rPr>
+                <w:rFonts w:ascii="Times New Roman" w:hAnsi="Times New Roman"/>
+                <w:b/>
+                <w:sz w:val="21"/>
+              </w:rPr>
+              <w:t>On a mobile browser</w:t>
+            </w:r>
+          </w:p>
+        </w:tc>
+      </w:tr>
+      <w:tr>
+        <w:trPr>
+          <w:cantSplit/>
+        </w:trPr>
+        <w:tc>
+          <w:tcPr>
+            <w:tcW w:type="dxa" w:w="2160"/>
+          </w:tcPr>
+          <w:p>
+            <w:pPr>
+              <w:spacing w:after="40" w:before="40"/>
+              <w:jc w:val="left"/>
+            </w:pPr>
+            <w:r>
+              <w:rPr>
+                <w:rFonts w:ascii="Times New Roman" w:hAnsi="Times New Roman"/>
+                <w:b/>
+                <w:sz w:val="21"/>
+              </w:rPr>
+              <w:t>type="email"</w:t>
+            </w:r>
+          </w:p>
+        </w:tc>
+        <w:tc>
+          <w:tcPr>
+            <w:tcW w:type="dxa" w:w="3600"/>
+          </w:tcPr>
+          <w:p>
+            <w:pPr>
+              <w:spacing w:after="40" w:before="40"/>
+              <w:jc w:val="left"/>
+            </w:pPr>
+            <w:r>
+              <w:rPr>
+                <w:rFonts w:ascii="Times New Roman" w:hAnsi="Times New Roman"/>
+                <w:b w:val="0"/>
+                <w:sz w:val="21"/>
+              </w:rPr>
+              <w:t>Rejects values without @ and a domain</w:t>
+            </w:r>
+          </w:p>
+        </w:tc>
+        <w:tc>
+          <w:tcPr>
+            <w:tcW w:type="dxa" w:w="3456"/>
+          </w:tcPr>
+          <w:p>
+            <w:pPr>
+              <w:spacing w:after="40" w:before="40"/>
+              <w:jc w:val="left"/>
+            </w:pPr>
+            <w:r>
+              <w:rPr>
+                <w:rFonts w:ascii="Times New Roman" w:hAnsi="Times New Roman"/>
+                <w:b w:val="0"/>
+                <w:sz w:val="21"/>
+              </w:rPr>
+              <w:t>Shows a keyboard with @ and .com keys</w:t>
+            </w:r>
+          </w:p>
+        </w:tc>
+      </w:tr>
+      <w:tr>
+        <w:trPr>
+          <w:cantSplit/>
+        </w:trPr>
+        <w:tc>
+          <w:tcPr>
+            <w:tcW w:type="dxa" w:w="2160"/>
+          </w:tcPr>
+          <w:p>
+            <w:pPr>
+              <w:spacing w:after="40" w:before="40"/>
+              <w:jc w:val="left"/>
+            </w:pPr>
+            <w:r>
+              <w:rPr>
+                <w:rFonts w:ascii="Times New Roman" w:hAnsi="Times New Roman"/>
+                <w:b/>
+                <w:sz w:val="21"/>
+              </w:rPr>
+              <w:t>type="tel"</w:t>
+            </w:r>
+          </w:p>
+        </w:tc>
+        <w:tc>
+          <w:tcPr>
+            <w:tcW w:type="dxa" w:w="3600"/>
+          </w:tcPr>
+          <w:p>
+            <w:pPr>
+              <w:spacing w:after="40" w:before="40"/>
+              <w:jc w:val="left"/>
+            </w:pPr>
+            <w:r>
+              <w:rPr>
+                <w:rFonts w:ascii="Times New Roman" w:hAnsi="Times New Roman"/>
+                <w:b w:val="0"/>
+                <w:sz w:val="21"/>
+              </w:rPr>
+              <w:t>Accepts text; pattern checks 10 digits</w:t>
+            </w:r>
+          </w:p>
+        </w:tc>
+        <w:tc>
+          <w:tcPr>
+            <w:tcW w:type="dxa" w:w="3456"/>
+          </w:tcPr>
+          <w:p>
+            <w:pPr>
+              <w:spacing w:after="40" w:before="40"/>
+              <w:jc w:val="left"/>
+            </w:pPr>
+            <w:r>
+              <w:rPr>
+                <w:rFonts w:ascii="Times New Roman" w:hAnsi="Times New Roman"/>
+                <w:b w:val="0"/>
+                <w:sz w:val="21"/>
+              </w:rPr>
+              <w:t>Shows the numeric dial pad</w:t>
+            </w:r>
+          </w:p>
+        </w:tc>
+      </w:tr>
+      <w:tr>
+        <w:trPr>
+          <w:cantSplit/>
+        </w:trPr>
+        <w:tc>
+          <w:tcPr>
+            <w:tcW w:type="dxa" w:w="2160"/>
+          </w:tcPr>
+          <w:p>
+            <w:pPr>
+              <w:spacing w:after="40" w:before="40"/>
+              <w:jc w:val="left"/>
+            </w:pPr>
+            <w:r>
+              <w:rPr>
+                <w:rFonts w:ascii="Times New Roman" w:hAnsi="Times New Roman"/>
+                <w:b/>
+                <w:sz w:val="21"/>
+              </w:rPr>
+              <w:t>type="date"</w:t>
+            </w:r>
+          </w:p>
+        </w:tc>
+        <w:tc>
+          <w:tcPr>
+            <w:tcW w:type="dxa" w:w="3600"/>
+          </w:tcPr>
+          <w:p>
+            <w:pPr>
+              <w:spacing w:after="40" w:before="40"/>
+              <w:jc w:val="left"/>
+            </w:pPr>
+            <w:r>
+              <w:rPr>
+                <w:rFonts w:ascii="Times New Roman" w:hAnsi="Times New Roman"/>
+                <w:b w:val="0"/>
+                <w:sz w:val="21"/>
+              </w:rPr>
+              <w:t>Calendar drop-down picker</w:t>
+            </w:r>
+          </w:p>
+        </w:tc>
+        <w:tc>
+          <w:tcPr>
+            <w:tcW w:type="dxa" w:w="3456"/>
+          </w:tcPr>
+          <w:p>
+            <w:pPr>
+              <w:spacing w:after="40" w:before="40"/>
+              <w:jc w:val="left"/>
+            </w:pPr>
+            <w:r>
+              <w:rPr>
+                <w:rFonts w:ascii="Times New Roman" w:hAnsi="Times New Roman"/>
+                <w:b w:val="0"/>
+                <w:sz w:val="21"/>
+              </w:rPr>
+              <w:t>Native date wheel / calendar</w:t>
+            </w:r>
+          </w:p>
+        </w:tc>
+      </w:tr>
+      <w:tr>
+        <w:trPr>
+          <w:cantSplit/>
+        </w:trPr>
+        <w:tc>
+          <w:tcPr>
+            <w:tcW w:type="dxa" w:w="2160"/>
+          </w:tcPr>
+          <w:p>
+            <w:pPr>
+              <w:spacing w:after="40" w:before="40"/>
+              <w:jc w:val="left"/>
+            </w:pPr>
+            <w:r>
+              <w:rPr>
+                <w:rFonts w:ascii="Times New Roman" w:hAnsi="Times New Roman"/>
+                <w:b/>
+                <w:sz w:val="21"/>
+              </w:rPr>
+              <w:t>type="password"</w:t>
+            </w:r>
+          </w:p>
+        </w:tc>
+        <w:tc>
+          <w:tcPr>
+            <w:tcW w:type="dxa" w:w="3600"/>
+          </w:tcPr>
+          <w:p>
+            <w:pPr>
+              <w:spacing w:after="40" w:before="40"/>
+              <w:jc w:val="left"/>
+            </w:pPr>
+            <w:r>
+              <w:rPr>
+                <w:rFonts w:ascii="Times New Roman" w:hAnsi="Times New Roman"/>
+                <w:b w:val="0"/>
+                <w:sz w:val="21"/>
+              </w:rPr>
+              <w:t>Characters shown as dots</w:t>
+            </w:r>
+          </w:p>
+        </w:tc>
+        <w:tc>
+          <w:tcPr>
+            <w:tcW w:type="dxa" w:w="3456"/>
+          </w:tcPr>
+          <w:p>
+            <w:pPr>
+              <w:spacing w:after="40" w:before="40"/>
+              <w:jc w:val="left"/>
+            </w:pPr>
+            <w:r>
+              <w:rPr>
+                <w:rFonts w:ascii="Times New Roman" w:hAnsi="Times New Roman"/>
+                <w:b w:val="0"/>
+                <w:sz w:val="21"/>
+              </w:rPr>
+              <w:t>Characters masked; no auto-capitalisation</w:t>
+            </w:r>
+          </w:p>
+        </w:tc>
+      </w:tr>
+      <w:tr>
+        <w:trPr>
+          <w:cantSplit/>
+        </w:trPr>
+        <w:tc>
+          <w:tcPr>
+            <w:tcW w:type="dxa" w:w="2160"/>
+          </w:tcPr>
+          <w:p>
+            <w:pPr>
+              <w:spacing w:after="40" w:before="40"/>
+              <w:jc w:val="left"/>
+            </w:pPr>
+            <w:r>
+              <w:rPr>
+                <w:rFonts w:ascii="Times New Roman" w:hAnsi="Times New Roman"/>
+                <w:b/>
+                <w:sz w:val="21"/>
+              </w:rPr>
+              <w:t>type="number"</w:t>
+            </w:r>
+          </w:p>
+        </w:tc>
+        <w:tc>
+          <w:tcPr>
+            <w:tcW w:type="dxa" w:w="3600"/>
+          </w:tcPr>
+          <w:p>
+            <w:pPr>
+              <w:spacing w:after="40" w:before="40"/>
+              <w:jc w:val="left"/>
+            </w:pPr>
+            <w:r>
+              <w:rPr>
+                <w:rFonts w:ascii="Times New Roman" w:hAnsi="Times New Roman"/>
+                <w:b w:val="0"/>
+                <w:sz w:val="21"/>
+              </w:rPr>
+              <w:t>Up / down spinner within min and max</w:t>
+            </w:r>
+          </w:p>
+        </w:tc>
+        <w:tc>
+          <w:tcPr>
+            <w:tcW w:type="dxa" w:w="3456"/>
+          </w:tcPr>
+          <w:p>
+            <w:pPr>
+              <w:spacing w:after="40" w:before="40"/>
+              <w:jc w:val="left"/>
+            </w:pPr>
+            <w:r>
+              <w:rPr>
+                <w:rFonts w:ascii="Times New Roman" w:hAnsi="Times New Roman"/>
+                <w:b w:val="0"/>
+                <w:sz w:val="21"/>
+              </w:rPr>
+              <w:t>Numeric keyboard</w:t>
+            </w:r>
+          </w:p>
+        </w:tc>
+      </w:tr>
+      <w:tr>
+        <w:trPr>
+          <w:cantSplit/>
+        </w:trPr>
+        <w:tc>
+          <w:tcPr>
+            <w:tcW w:type="dxa" w:w="2160"/>
+          </w:tcPr>
+          <w:p>
+            <w:pPr>
+              <w:spacing w:after="40" w:before="40"/>
+              <w:jc w:val="left"/>
+            </w:pPr>
+            <w:r>
+              <w:rPr>
+                <w:rFonts w:ascii="Times New Roman" w:hAnsi="Times New Roman"/>
+                <w:b/>
+                <w:sz w:val="21"/>
+              </w:rPr>
+              <w:t>type="url"</w:t>
+            </w:r>
+          </w:p>
+        </w:tc>
+        <w:tc>
+          <w:tcPr>
+            <w:tcW w:type="dxa" w:w="3600"/>
+          </w:tcPr>
+          <w:p>
+            <w:pPr>
+              <w:spacing w:after="40" w:before="40"/>
+              <w:jc w:val="left"/>
+            </w:pPr>
+            <w:r>
+              <w:rPr>
+                <w:rFonts w:ascii="Times New Roman" w:hAnsi="Times New Roman"/>
+                <w:b w:val="0"/>
+                <w:sz w:val="21"/>
+              </w:rPr>
+              <w:t>Rejects values without a scheme</w:t>
+            </w:r>
+          </w:p>
+        </w:tc>
+        <w:tc>
+          <w:tcPr>
+            <w:tcW w:type="dxa" w:w="3456"/>
+          </w:tcPr>
+          <w:p>
+            <w:pPr>
+              <w:spacing w:after="40" w:before="40"/>
+              <w:jc w:val="left"/>
+            </w:pPr>
+            <w:r>
+              <w:rPr>
+                <w:rFonts w:ascii="Times New Roman" w:hAnsi="Times New Roman"/>
+                <w:b w:val="0"/>
+                <w:sz w:val="21"/>
+              </w:rPr>
+              <w:t>Keyboard with / and .com keys</w:t>
+            </w:r>
+          </w:p>
+        </w:tc>
+      </w:tr>
+      <w:tr>
+        <w:trPr>
+          <w:cantSplit/>
+        </w:trPr>
+        <w:tc>
+          <w:tcPr>
+            <w:tcW w:type="dxa" w:w="2160"/>
+          </w:tcPr>
+          <w:p>
+            <w:pPr>
+              <w:spacing w:after="40" w:before="40"/>
+              <w:jc w:val="left"/>
+            </w:pPr>
+            <w:r>
+              <w:rPr>
+                <w:rFonts w:ascii="Times New Roman" w:hAnsi="Times New Roman"/>
+                <w:b/>
+                <w:sz w:val="21"/>
+              </w:rPr>
+              <w:t>type="range"</w:t>
+            </w:r>
+          </w:p>
+        </w:tc>
+        <w:tc>
+          <w:tcPr>
+            <w:tcW w:type="dxa" w:w="3600"/>
+          </w:tcPr>
+          <w:p>
+            <w:pPr>
+              <w:spacing w:after="40" w:before="40"/>
+              <w:jc w:val="left"/>
+            </w:pPr>
+            <w:r>
+              <w:rPr>
+                <w:rFonts w:ascii="Times New Roman" w:hAnsi="Times New Roman"/>
+                <w:b w:val="0"/>
+                <w:sz w:val="21"/>
+              </w:rPr>
+              <w:t>Draggable slider</w:t>
+            </w:r>
+          </w:p>
+        </w:tc>
+        <w:tc>
+          <w:tcPr>
+            <w:tcW w:type="dxa" w:w="3456"/>
+          </w:tcPr>
+          <w:p>
+            <w:pPr>
+              <w:spacing w:after="40" w:before="40"/>
+              <w:jc w:val="left"/>
+            </w:pPr>
+            <w:r>
+              <w:rPr>
+                <w:rFonts w:ascii="Times New Roman" w:hAnsi="Times New Roman"/>
+                <w:b w:val="0"/>
+                <w:sz w:val="21"/>
+              </w:rPr>
+              <w:t>Touch slider</w:t>
+            </w:r>
+          </w:p>
+        </w:tc>
+      </w:tr>
+    </w:tbl>
+    <w:p>
+      <w:pPr>
+        <w:spacing w:after="80" w:before="0" w:line="276" w:lineRule="auto"/>
+        <w:jc w:val="both"/>
+      </w:pPr>
+    </w:p>
+    <w:p>
+      <w:pPr>
+        <w:keepNext/>
+        <w:spacing w:after="80" w:before="120" w:line="276" w:lineRule="auto"/>
+        <w:jc w:val="left"/>
+      </w:pPr>
+      <w:r>
+        <w:rPr>
+          <w:rFonts w:ascii="Times New Roman" w:hAnsi="Times New Roman" w:eastAsia="Times New Roman"/>
+          <w:b/>
+          <w:i w:val="0"/>
+          <w:sz w:val="24"/>
+        </w:rPr>
         <w:t>Learning outcomes</w:t>
       </w:r>
     </w:p>
@@ -9697,6 +10857,52 @@
           <w:sz w:val="24"/>
         </w:rPr>
         <w:t>Used JavaScript and CSS to give instant visual feedback and a responsive design.</w:t>
+      </w:r>
+    </w:p>
+    <w:p>
+      <w:pPr>
+        <w:keepNext/>
+        <w:spacing w:after="80" w:before="120" w:line="276" w:lineRule="auto"/>
+        <w:jc w:val="left"/>
+      </w:pPr>
+      <w:r>
+        <w:rPr>
+          <w:rFonts w:ascii="Times New Roman" w:hAnsi="Times New Roman" w:eastAsia="Times New Roman"/>
+          <w:b/>
+          <w:i w:val="0"/>
+          <w:sz w:val="24"/>
+        </w:rPr>
+        <w:t>Conclusion</w:t>
+      </w:r>
+    </w:p>
+    <w:p>
+      <w:pPr>
+        <w:spacing w:after="120" w:before="0" w:line="276" w:lineRule="auto"/>
+        <w:jc w:val="both"/>
+      </w:pPr>
+      <w:r>
+        <w:rPr>
+          <w:rFonts w:ascii="Times New Roman" w:hAnsi="Times New Roman" w:eastAsia="Times New Roman"/>
+          <w:b w:val="0"/>
+          <w:i w:val="0"/>
+          <w:sz w:val="24"/>
+        </w:rPr>
+        <w:t>Choosing the right HTML5 input type is the first and simplest level of validation. With type="email", type="tel", type="date" and type="password", the browser itself gives the student the correct keyboard, picker or masking and checks the format before the data reaches the server. Combined with attributes such as required, pattern, min and max, and a little JavaScript for friendly messages, the LearnHub registration form collects accurate data with less effort for both the student and the portal.</w:t>
+      </w:r>
+    </w:p>
+    <w:p>
+      <w:pPr>
+        <w:spacing w:after="120" w:before="0" w:line="276" w:lineRule="auto"/>
+        <w:jc w:val="both"/>
+      </w:pPr>
+      <w:r>
+        <w:rPr>
+          <w:rFonts w:ascii="Times New Roman" w:hAnsi="Times New Roman" w:eastAsia="Times New Roman"/>
+          <w:b w:val="0"/>
+          <w:i w:val="0"/>
+          <w:sz w:val="24"/>
+        </w:rPr>
+        <w:t>The next section shows the form running in the browser in its different states, starting with the blank form and ending with the mobile view and the test results.</w:t>
       </w:r>
     </w:p>
     <w:p>
@@ -9759,7 +10965,7 @@
       <w:r>
         <w:drawing>
           <wp:inline xmlns:a="http://schemas.openxmlformats.org/drawingml/2006/main" xmlns:pic="http://schemas.openxmlformats.org/drawingml/2006/picture">
-            <wp:extent cx="4849623" cy="6303544"/>
+            <wp:extent cx="5552467" cy="7217101"/>
             <wp:docPr id="1" name="Picture 1"/>
             <wp:cNvGraphicFramePr>
               <a:graphicFrameLocks noChangeAspect="1"/>
@@ -9780,7 +10986,7 @@
                   <pic:spPr>
                     <a:xfrm>
                       <a:off x="0" y="0"/>
-                      <a:ext cx="4849623" cy="6303544"/>
+                      <a:ext cx="5552467" cy="7217101"/>
                     </a:xfrm>
                     <a:prstGeom prst="rect"/>
                   </pic:spPr>
@@ -9831,7 +11037,7 @@
       <w:r>
         <w:drawing>
           <wp:inline xmlns:a="http://schemas.openxmlformats.org/drawingml/2006/main" xmlns:pic="http://schemas.openxmlformats.org/drawingml/2006/picture">
-            <wp:extent cx="5497534" cy="7216882"/>
+            <wp:extent cx="5852160" cy="7682417"/>
             <wp:docPr id="2" name="Picture 2"/>
             <wp:cNvGraphicFramePr>
               <a:graphicFrameLocks noChangeAspect="1"/>
@@ -9852,7 +11058,7 @@
                   <pic:spPr>
                     <a:xfrm>
                       <a:off x="0" y="0"/>
-                      <a:ext cx="5497534" cy="7216882"/>
+                      <a:ext cx="5852160" cy="7682417"/>
                     </a:xfrm>
                     <a:prstGeom prst="rect"/>
                   </pic:spPr>
@@ -9903,7 +11109,7 @@
       <w:r>
         <w:drawing>
           <wp:inline xmlns:a="http://schemas.openxmlformats.org/drawingml/2006/main" xmlns:pic="http://schemas.openxmlformats.org/drawingml/2006/picture">
-            <wp:extent cx="5497534" cy="7216882"/>
+            <wp:extent cx="5852160" cy="7682417"/>
             <wp:docPr id="3" name="Picture 3"/>
             <wp:cNvGraphicFramePr>
               <a:graphicFrameLocks noChangeAspect="1"/>
@@ -9924,7 +11130,7 @@
                   <pic:spPr>
                     <a:xfrm>
                       <a:off x="0" y="0"/>
-                      <a:ext cx="5497534" cy="7216882"/>
+                      <a:ext cx="5852160" cy="7682417"/>
                     </a:xfrm>
                     <a:prstGeom prst="rect"/>
                   </pic:spPr>
@@ -9975,7 +11181,7 @@
       <w:r>
         <w:drawing>
           <wp:inline xmlns:a="http://schemas.openxmlformats.org/drawingml/2006/main" xmlns:pic="http://schemas.openxmlformats.org/drawingml/2006/picture">
-            <wp:extent cx="5552467" cy="7217101"/>
+            <wp:extent cx="5852160" cy="7606642"/>
             <wp:docPr id="4" name="Picture 4"/>
             <wp:cNvGraphicFramePr>
               <a:graphicFrameLocks noChangeAspect="1"/>
@@ -9996,7 +11202,7 @@
                   <pic:spPr>
                     <a:xfrm>
                       <a:off x="0" y="0"/>
-                      <a:ext cx="5552467" cy="7217101"/>
+                      <a:ext cx="5852160" cy="7606642"/>
                     </a:xfrm>
                     <a:prstGeom prst="rect"/>
                   </pic:spPr>
@@ -10047,7 +11253,7 @@
       <w:r>
         <w:drawing>
           <wp:inline xmlns:a="http://schemas.openxmlformats.org/drawingml/2006/main" xmlns:pic="http://schemas.openxmlformats.org/drawingml/2006/picture">
-            <wp:extent cx="5215711" cy="7215760"/>
+            <wp:extent cx="5809906" cy="8037808"/>
             <wp:docPr id="5" name="Picture 5"/>
             <wp:cNvGraphicFramePr>
               <a:graphicFrameLocks noChangeAspect="1"/>
@@ -10068,7 +11274,7 @@
                   <pic:spPr>
                     <a:xfrm>
                       <a:off x="0" y="0"/>
-                      <a:ext cx="5215711" cy="7215760"/>
+                      <a:ext cx="5809906" cy="8037808"/>
                     </a:xfrm>
                     <a:prstGeom prst="rect"/>
                   </pic:spPr>
@@ -10975,10 +12181,10 @@
       </w:r>
     </w:p>
     <w:sectPr>
-      <w:headerReference w:type="default" r:id="rId8"/>
       <w:footerReference w:type="default" r:id="rId17"/>
+      <w:headerReference w:type="default" r:id="rId18"/>
       <w:pgSz w:w="11907" w:h="16840" w:code="9"/>
-      <w:pgMar w:top="1020" w:right="1134" w:bottom="864" w:left="1440" w:header="709" w:footer="360" w:gutter="0"/>
+      <w:pgMar w:top="1152" w:right="1134" w:bottom="864" w:left="1440" w:header="709" w:footer="360" w:gutter="0"/>
       <w:pgBorders w:offsetFrom="page">
         <w:top w:val="single" w:sz="12" w:space="20" w:color="000000"/>
         <w:left w:val="single" w:sz="12" w:space="20" w:color="000000"/>
@@ -11018,13 +12224,6 @@
       <w:pStyle w:val="Footer"/>
       <w:jc w:val="center"/>
     </w:pPr>
-    <w:r>
-      <w:rPr>
-        <w:rFonts w:ascii="Times New Roman" w:hAnsi="Times New Roman"/>
-        <w:sz w:val="20"/>
-      </w:rPr>
-      <w:t xml:space="preserve">Page </w:t>
-    </w:r>
     <w:r>
       <w:rPr>
         <w:rFonts w:ascii="Times New Roman" w:hAnsi="Times New Roman"/>
@@ -11168,6 +12367,16 @@
     </w:r>
     <w:bookmarkEnd w:id="1"/>
     <w:bookmarkEnd w:id="2"/>
+  </w:p>
+</w:hdr>
+</file>
+
+<file path=word/header2.xml><?xml version="1.0" encoding="utf-8"?>
+<w:hdr xmlns:m="http://schemas.openxmlformats.org/officeDocument/2006/math" xmlns:mc="http://schemas.openxmlformats.org/markup-compatibility/2006" xmlns:mo="http://schemas.microsoft.com/office/mac/office/2008/main" xmlns:mv="urn:schemas-microsoft-com:mac:vml" xmlns:o="urn:schemas-microsoft-com:office:office" xmlns:r="http://schemas.openxmlformats.org/officeDocument/2006/relationships" xmlns:v="urn:schemas-microsoft-com:vml" xmlns:w10="urn:schemas-microsoft-com:office:word" xmlns:w14="http://schemas.microsoft.com/office/word/2010/wordml" xmlns:w="http://schemas.openxmlformats.org/wordprocessingml/2006/main" xmlns:wne="http://schemas.microsoft.com/office/word/2006/wordml" xmlns:wp14="http://schemas.microsoft.com/office/word/2010/wordprocessingDrawing" xmlns:wp="http://schemas.openxmlformats.org/drawingml/2006/wordprocessingDrawing" xmlns:wpc="http://schemas.microsoft.com/office/word/2010/wordprocessingCanvas" xmlns:wpg="http://schemas.microsoft.com/office/word/2010/wordprocessingGroup" xmlns:wpi="http://schemas.microsoft.com/office/word/2010/wordprocessingInk" xmlns:wps="http://schemas.microsoft.com/office/word/2010/wordprocessingShape" mc:Ignorable="w14 wp14">
+  <w:p>
+    <w:pPr>
+      <w:pStyle w:val="Header"/>
+    </w:pPr>
   </w:p>
 </w:hdr>
 </file>

</xml_diff>